<commit_message>
Add some aos animation
</commit_message>
<xml_diff>
--- a/Report/BlogScript Final Report.docx
+++ b/Report/BlogScript Final Report.docx
@@ -5,6 +5,7 @@
     <w:p>
       <w:pPr>
         <w:ind w:right="288"/>
+        <w:jc w:val="center"/>
         <w:rPr>
           <w:rFonts w:asciiTheme="minorHAnsi" w:hAnsiTheme="minorHAnsi" w:cstheme="minorHAnsi"/>
           <w:b/>
@@ -18,7 +19,15 @@
           <w:b/>
           <w:sz w:val="48"/>
         </w:rPr>
-        <w:t>CRUD based Blog web application (BlogScript)</w:t>
+        <w:t>BlogScript</w:t>
+      </w:r>
+      <w:r>
+        <w:rPr>
+          <w:rFonts w:asciiTheme="minorHAnsi" w:hAnsiTheme="minorHAnsi" w:cstheme="minorHAnsi"/>
+          <w:b/>
+          <w:sz w:val="48"/>
+        </w:rPr>
+        <w:t xml:space="preserve"> Blog Web Application</w:t>
       </w:r>
     </w:p>
     <w:bookmarkEnd w:id="0"/>
@@ -314,7 +323,7 @@
                 <w:sz w:val="24"/>
                 <w:szCs w:val="24"/>
               </w:rPr>
-              <w:t xml:space="preserve">MR. </w:t>
+              <w:t xml:space="preserve">           </w:t>
             </w:r>
             <w:r>
               <w:rPr>
@@ -323,7 +332,7 @@
                 <w:sz w:val="24"/>
                 <w:szCs w:val="24"/>
               </w:rPr>
-              <w:t>NITIN KUMAR SAINI</w:t>
+              <w:t>MR.</w:t>
             </w:r>
             <w:r>
               <w:rPr>
@@ -332,63 +341,7 @@
                 <w:sz w:val="24"/>
                 <w:szCs w:val="24"/>
               </w:rPr>
-              <w:t xml:space="preserve"> </w:t>
-            </w:r>
-          </w:p>
-          <w:p>
-            <w:pPr>
-              <w:ind w:right="288"/>
-              <w:rPr>
-                <w:rFonts w:asciiTheme="minorHAnsi" w:hAnsiTheme="minorHAnsi" w:cstheme="minorHAnsi"/>
-                <w:bCs/>
-                <w:sz w:val="24"/>
-                <w:szCs w:val="24"/>
-              </w:rPr>
-            </w:pPr>
-            <w:r>
-              <w:rPr>
-                <w:rFonts w:asciiTheme="minorHAnsi" w:hAnsiTheme="minorHAnsi" w:cstheme="minorHAnsi"/>
-                <w:bCs/>
-                <w:sz w:val="24"/>
-                <w:szCs w:val="24"/>
-              </w:rPr>
-              <w:t>&amp; M</w:t>
-            </w:r>
-            <w:r>
-              <w:rPr>
-                <w:rFonts w:asciiTheme="minorHAnsi" w:hAnsiTheme="minorHAnsi" w:cstheme="minorHAnsi"/>
-                <w:bCs/>
-                <w:sz w:val="24"/>
-                <w:szCs w:val="24"/>
-              </w:rPr>
-              <w:t>S. V</w:t>
-            </w:r>
-            <w:r>
-              <w:rPr>
-                <w:rFonts w:asciiTheme="minorHAnsi" w:hAnsiTheme="minorHAnsi" w:cstheme="minorHAnsi"/>
-                <w:bCs/>
-                <w:sz w:val="24"/>
-                <w:szCs w:val="24"/>
-              </w:rPr>
-              <w:t>RA</w:t>
-            </w:r>
-            <w:r>
-              <w:rPr>
-                <w:rFonts w:asciiTheme="minorHAnsi" w:hAnsiTheme="minorHAnsi" w:cstheme="minorHAnsi"/>
-                <w:bCs/>
-                <w:sz w:val="24"/>
-                <w:szCs w:val="24"/>
-              </w:rPr>
-              <w:t xml:space="preserve">TIKA </w:t>
-            </w:r>
-            <w:r>
-              <w:rPr>
-                <w:rFonts w:asciiTheme="minorHAnsi" w:hAnsiTheme="minorHAnsi" w:cstheme="minorHAnsi"/>
-                <w:bCs/>
-                <w:sz w:val="24"/>
-                <w:szCs w:val="24"/>
-              </w:rPr>
-              <w:t>GUPTA</w:t>
+              <w:t xml:space="preserve"> AJAY SINGH</w:t>
             </w:r>
           </w:p>
           <w:p>
@@ -1006,7 +959,7 @@
           <w:sz w:val="24"/>
           <w:szCs w:val="24"/>
         </w:rPr>
-        <w:t>Banty Mishra (TCA2301154)</w:t>
+        <w:t>Rajnish Kumar (TCA2301573)</w:t>
       </w:r>
     </w:p>
     <w:p>
@@ -1109,7 +1062,7 @@
           <w:sz w:val="32"/>
           <w:szCs w:val="32"/>
         </w:rPr>
-        <w:t xml:space="preserve"> CRUD based </w:t>
+        <w:t xml:space="preserve"> </w:t>
       </w:r>
       <w:r>
         <w:rPr>
@@ -1119,7 +1072,7 @@
           <w:sz w:val="32"/>
           <w:szCs w:val="32"/>
         </w:rPr>
-        <w:t>b</w:t>
+        <w:t>BlogScript Blog We</w:t>
       </w:r>
       <w:r>
         <w:rPr>
@@ -1129,7 +1082,27 @@
           <w:sz w:val="32"/>
           <w:szCs w:val="32"/>
         </w:rPr>
-        <w:t xml:space="preserve">log web application (BlogScript)  </w:t>
+        <w:t>b</w:t>
+      </w:r>
+      <w:r>
+        <w:rPr>
+          <w:rFonts w:asciiTheme="minorHAnsi" w:hAnsiTheme="minorHAnsi" w:cstheme="minorHAnsi"/>
+          <w:b/>
+          <w:bCs/>
+          <w:sz w:val="32"/>
+          <w:szCs w:val="32"/>
+        </w:rPr>
+        <w:t xml:space="preserve"> Application </w:t>
+      </w:r>
+      <w:r>
+        <w:rPr>
+          <w:rFonts w:asciiTheme="minorHAnsi" w:hAnsiTheme="minorHAnsi" w:cstheme="minorHAnsi"/>
+          <w:b/>
+          <w:bCs/>
+          <w:sz w:val="32"/>
+          <w:szCs w:val="32"/>
+        </w:rPr>
+        <w:t xml:space="preserve">  </w:t>
       </w:r>
       <w:r>
         <w:rPr>
@@ -1172,7 +1145,7 @@
       <w:tr>
         <w:tc>
           <w:tcPr>
-            <w:tcW w:w="7291" w:type="dxa"/>
+            <w:tcW w:w="7401" w:type="dxa"/>
             <w:gridSpan w:val="2"/>
           </w:tcPr>
           <w:p>
@@ -1201,7 +1174,7 @@
         </w:tc>
         <w:tc>
           <w:tcPr>
-            <w:tcW w:w="3005" w:type="dxa"/>
+            <w:tcW w:w="2895" w:type="dxa"/>
           </w:tcPr>
           <w:p>
             <w:pPr>
@@ -1222,7 +1195,7 @@
       <w:tr>
         <w:tc>
           <w:tcPr>
-            <w:tcW w:w="4219" w:type="dxa"/>
+            <w:tcW w:w="3980" w:type="dxa"/>
           </w:tcPr>
           <w:p>
             <w:pPr>
@@ -1250,7 +1223,7 @@
         </w:tc>
         <w:tc>
           <w:tcPr>
-            <w:tcW w:w="3072" w:type="dxa"/>
+            <w:tcW w:w="3421" w:type="dxa"/>
           </w:tcPr>
           <w:p>
             <w:pPr>
@@ -1278,7 +1251,7 @@
         </w:tc>
         <w:tc>
           <w:tcPr>
-            <w:tcW w:w="3005" w:type="dxa"/>
+            <w:tcW w:w="2895" w:type="dxa"/>
           </w:tcPr>
           <w:p>
             <w:pPr>
@@ -1308,7 +1281,7 @@
       <w:tr>
         <w:tc>
           <w:tcPr>
-            <w:tcW w:w="4219" w:type="dxa"/>
+            <w:tcW w:w="3980" w:type="dxa"/>
           </w:tcPr>
           <w:p>
             <w:pPr>
@@ -1332,7 +1305,7 @@
         </w:tc>
         <w:tc>
           <w:tcPr>
-            <w:tcW w:w="3072" w:type="dxa"/>
+            <w:tcW w:w="3421" w:type="dxa"/>
           </w:tcPr>
           <w:p>
             <w:pPr>
@@ -1364,7 +1337,7 @@
         </w:tc>
         <w:tc>
           <w:tcPr>
-            <w:tcW w:w="3005" w:type="dxa"/>
+            <w:tcW w:w="2895" w:type="dxa"/>
           </w:tcPr>
           <w:p>
             <w:pPr>
@@ -1384,7 +1357,7 @@
       <w:tr>
         <w:tc>
           <w:tcPr>
-            <w:tcW w:w="4219" w:type="dxa"/>
+            <w:tcW w:w="3980" w:type="dxa"/>
           </w:tcPr>
           <w:p>
             <w:pPr>
@@ -1408,7 +1381,7 @@
         </w:tc>
         <w:tc>
           <w:tcPr>
-            <w:tcW w:w="3072" w:type="dxa"/>
+            <w:tcW w:w="3421" w:type="dxa"/>
           </w:tcPr>
           <w:p>
             <w:pPr>
@@ -1420,13 +1393,23 @@
                 <w:szCs w:val="32"/>
               </w:rPr>
             </w:pPr>
+            <w:proofErr w:type="spellStart"/>
             <w:r>
               <w:rPr>
                 <w:rFonts w:asciiTheme="minorHAnsi" w:hAnsiTheme="minorHAnsi" w:cstheme="minorHAnsi"/>
                 <w:sz w:val="32"/>
                 <w:szCs w:val="32"/>
               </w:rPr>
-              <w:t>Rahul Kumar Senuhar</w:t>
+              <w:t>RahulKumar</w:t>
+            </w:r>
+            <w:proofErr w:type="spellEnd"/>
+            <w:r>
+              <w:rPr>
+                <w:rFonts w:asciiTheme="minorHAnsi" w:hAnsiTheme="minorHAnsi" w:cstheme="minorHAnsi"/>
+                <w:sz w:val="32"/>
+                <w:szCs w:val="32"/>
+              </w:rPr>
+              <w:t xml:space="preserve"> Senuhar</w:t>
             </w:r>
             <w:r>
               <w:rPr>
@@ -1440,7 +1423,7 @@
         </w:tc>
         <w:tc>
           <w:tcPr>
-            <w:tcW w:w="3005" w:type="dxa"/>
+            <w:tcW w:w="2895" w:type="dxa"/>
           </w:tcPr>
           <w:p>
             <w:pPr>
@@ -1460,7 +1443,7 @@
       <w:tr>
         <w:tc>
           <w:tcPr>
-            <w:tcW w:w="4219" w:type="dxa"/>
+            <w:tcW w:w="3980" w:type="dxa"/>
           </w:tcPr>
           <w:p>
             <w:pPr>
@@ -1484,7 +1467,7 @@
         </w:tc>
         <w:tc>
           <w:tcPr>
-            <w:tcW w:w="3072" w:type="dxa"/>
+            <w:tcW w:w="3421" w:type="dxa"/>
           </w:tcPr>
           <w:p>
             <w:pPr>
@@ -1502,7 +1485,7 @@
                 <w:sz w:val="32"/>
                 <w:szCs w:val="32"/>
               </w:rPr>
-              <w:t>Banty Mishra</w:t>
+              <w:t>Rajnish Kumar</w:t>
             </w:r>
             <w:r>
               <w:rPr>
@@ -1510,13 +1493,21 @@
                 <w:sz w:val="32"/>
                 <w:szCs w:val="32"/>
               </w:rPr>
-              <w:t xml:space="preserve"> (TCA2301154)</w:t>
+              <w:t xml:space="preserve"> (TCA2301</w:t>
+            </w:r>
+            <w:r>
+              <w:rPr>
+                <w:rFonts w:asciiTheme="minorHAnsi" w:hAnsiTheme="minorHAnsi" w:cstheme="minorHAnsi"/>
+                <w:sz w:val="32"/>
+                <w:szCs w:val="32"/>
+              </w:rPr>
+              <w:t>573)</w:t>
             </w:r>
           </w:p>
         </w:tc>
         <w:tc>
           <w:tcPr>
-            <w:tcW w:w="3005" w:type="dxa"/>
+            <w:tcW w:w="2895" w:type="dxa"/>
           </w:tcPr>
           <w:p>
             <w:pPr>
@@ -1536,7 +1527,7 @@
       <w:tr>
         <w:tc>
           <w:tcPr>
-            <w:tcW w:w="4219" w:type="dxa"/>
+            <w:tcW w:w="3980" w:type="dxa"/>
           </w:tcPr>
           <w:p>
             <w:pPr>
@@ -1560,7 +1551,7 @@
         </w:tc>
         <w:tc>
           <w:tcPr>
-            <w:tcW w:w="3072" w:type="dxa"/>
+            <w:tcW w:w="3421" w:type="dxa"/>
           </w:tcPr>
           <w:p>
             <w:pPr>
@@ -1578,75 +1569,7 @@
                 <w:sz w:val="32"/>
                 <w:szCs w:val="32"/>
               </w:rPr>
-              <w:t>Mr. Nitin Kumar Saini</w:t>
-            </w:r>
-          </w:p>
-        </w:tc>
-        <w:tc>
-          <w:tcPr>
-            <w:tcW w:w="3005" w:type="dxa"/>
-          </w:tcPr>
-          <w:p>
-            <w:pPr>
-              <w:spacing w:line="360" w:lineRule="auto"/>
-              <w:ind w:right="288"/>
-              <w:rPr>
-                <w:rFonts w:asciiTheme="minorHAnsi" w:hAnsiTheme="minorHAnsi" w:cstheme="minorHAnsi"/>
-                <w:b/>
-                <w:bCs/>
-                <w:sz w:val="32"/>
-                <w:szCs w:val="32"/>
-              </w:rPr>
-            </w:pPr>
-          </w:p>
-        </w:tc>
-      </w:tr>
-      <w:tr>
-        <w:tc>
-          <w:tcPr>
-            <w:tcW w:w="4219" w:type="dxa"/>
-          </w:tcPr>
-          <w:p>
-            <w:pPr>
-              <w:spacing w:line="360" w:lineRule="auto"/>
-              <w:ind w:right="288"/>
-              <w:rPr>
-                <w:rFonts w:asciiTheme="minorHAnsi" w:hAnsiTheme="minorHAnsi" w:cstheme="minorHAnsi"/>
-                <w:sz w:val="32"/>
-                <w:szCs w:val="32"/>
-              </w:rPr>
-            </w:pPr>
-            <w:r>
-              <w:rPr>
-                <w:rFonts w:asciiTheme="minorHAnsi" w:hAnsiTheme="minorHAnsi" w:cstheme="minorHAnsi"/>
-                <w:sz w:val="32"/>
-                <w:szCs w:val="32"/>
-              </w:rPr>
-              <w:t>Project Guide :</w:t>
-            </w:r>
-          </w:p>
-        </w:tc>
-        <w:tc>
-          <w:tcPr>
-            <w:tcW w:w="3072" w:type="dxa"/>
-          </w:tcPr>
-          <w:p>
-            <w:pPr>
-              <w:spacing w:line="360" w:lineRule="auto"/>
-              <w:ind w:right="288"/>
-              <w:rPr>
-                <w:rFonts w:asciiTheme="minorHAnsi" w:hAnsiTheme="minorHAnsi" w:cstheme="minorHAnsi"/>
-                <w:sz w:val="32"/>
-                <w:szCs w:val="32"/>
-              </w:rPr>
-            </w:pPr>
-            <w:r>
-              <w:rPr>
-                <w:rFonts w:asciiTheme="minorHAnsi" w:hAnsiTheme="minorHAnsi" w:cstheme="minorHAnsi"/>
-                <w:sz w:val="32"/>
-                <w:szCs w:val="32"/>
-              </w:rPr>
-              <w:t>Ms. V</w:t>
+              <w:t xml:space="preserve">Mr. </w:t>
             </w:r>
             <w:r>
               <w:rPr>
@@ -1654,21 +1577,13 @@
                 <w:sz w:val="32"/>
                 <w:szCs w:val="32"/>
               </w:rPr>
-              <w:t>ra</w:t>
-            </w:r>
-            <w:r>
-              <w:rPr>
-                <w:rFonts w:asciiTheme="minorHAnsi" w:hAnsiTheme="minorHAnsi" w:cstheme="minorHAnsi"/>
-                <w:sz w:val="32"/>
-                <w:szCs w:val="32"/>
-              </w:rPr>
-              <w:t>tika Gupta</w:t>
+              <w:t xml:space="preserve">Ajay Singh </w:t>
             </w:r>
           </w:p>
         </w:tc>
         <w:tc>
           <w:tcPr>
-            <w:tcW w:w="3005" w:type="dxa"/>
+            <w:tcW w:w="2895" w:type="dxa"/>
           </w:tcPr>
           <w:p>
             <w:pPr>
@@ -1715,537 +1630,6 @@
     <w:p>
       <w:pPr>
         <w:ind w:right="288"/>
-        <w:jc w:val="center"/>
-        <w:rPr>
-          <w:rFonts w:asciiTheme="minorHAnsi" w:hAnsiTheme="minorHAnsi" w:cstheme="minorHAnsi"/>
-          <w:b/>
-          <w:bCs/>
-          <w:sz w:val="32"/>
-          <w:szCs w:val="32"/>
-        </w:rPr>
-      </w:pPr>
-      <w:r>
-        <w:rPr>
-          <w:rFonts w:asciiTheme="minorHAnsi" w:hAnsiTheme="minorHAnsi" w:cstheme="minorHAnsi"/>
-          <w:b/>
-          <w:bCs/>
-          <w:sz w:val="32"/>
-          <w:szCs w:val="32"/>
-        </w:rPr>
-        <w:t>BRIEF ABOUT THE COMPANY</w:t>
-      </w:r>
-    </w:p>
-    <w:p>
-      <w:pPr>
-        <w:ind w:right="288"/>
-        <w:jc w:val="center"/>
-        <w:rPr>
-          <w:rFonts w:asciiTheme="minorHAnsi" w:hAnsiTheme="minorHAnsi" w:cstheme="minorHAnsi"/>
-          <w:b/>
-          <w:bCs/>
-          <w:sz w:val="32"/>
-          <w:szCs w:val="32"/>
-        </w:rPr>
-      </w:pPr>
-    </w:p>
-    <w:p>
-      <w:pPr>
-        <w:contextualSpacing/>
-        <w:rPr>
-          <w:rFonts w:asciiTheme="minorHAnsi" w:eastAsia="Times New Roman" w:hAnsiTheme="minorHAnsi" w:cstheme="minorHAnsi"/>
-          <w:sz w:val="24"/>
-          <w:szCs w:val="24"/>
-          <w:lang w:val="en-IN" w:eastAsia="en-IN" w:bidi="hi-IN"/>
-        </w:rPr>
-      </w:pPr>
-      <w:r>
-        <w:rPr>
-          <w:rFonts w:asciiTheme="minorHAnsi" w:eastAsia="Times New Roman" w:hAnsiTheme="minorHAnsi" w:cstheme="minorHAnsi"/>
-          <w:sz w:val="24"/>
-          <w:szCs w:val="24"/>
-          <w:lang w:val="en-IN" w:eastAsia="en-IN" w:bidi="hi-IN"/>
-        </w:rPr>
-        <w:t xml:space="preserve">The internship for the </w:t>
-      </w:r>
-      <w:r>
-        <w:rPr>
-          <w:rFonts w:asciiTheme="minorHAnsi" w:eastAsia="Times New Roman" w:hAnsiTheme="minorHAnsi" w:cstheme="minorHAnsi"/>
-          <w:b/>
-          <w:bCs/>
-          <w:sz w:val="24"/>
-          <w:szCs w:val="24"/>
-          <w:lang w:val="en-IN" w:eastAsia="en-IN" w:bidi="hi-IN"/>
-        </w:rPr>
-        <w:t>BlogScript – CRUD Based Blog Web Application</w:t>
-      </w:r>
-      <w:r>
-        <w:rPr>
-          <w:rFonts w:asciiTheme="minorHAnsi" w:eastAsia="Times New Roman" w:hAnsiTheme="minorHAnsi" w:cstheme="minorHAnsi"/>
-          <w:sz w:val="24"/>
-          <w:szCs w:val="24"/>
-          <w:lang w:val="en-IN" w:eastAsia="en-IN" w:bidi="hi-IN"/>
-        </w:rPr>
-        <w:t xml:space="preserve"> was carried out under </w:t>
-      </w:r>
-      <w:proofErr w:type="spellStart"/>
-      <w:r>
-        <w:rPr>
-          <w:rFonts w:asciiTheme="minorHAnsi" w:eastAsia="Times New Roman" w:hAnsiTheme="minorHAnsi" w:cstheme="minorHAnsi"/>
-          <w:b/>
-          <w:bCs/>
-          <w:sz w:val="24"/>
-          <w:szCs w:val="24"/>
-          <w:lang w:val="en-IN" w:eastAsia="en-IN" w:bidi="hi-IN"/>
-        </w:rPr>
-        <w:t>ApexPlanet</w:t>
-      </w:r>
-      <w:proofErr w:type="spellEnd"/>
-      <w:r>
-        <w:rPr>
-          <w:rFonts w:asciiTheme="minorHAnsi" w:eastAsia="Times New Roman" w:hAnsiTheme="minorHAnsi" w:cstheme="minorHAnsi"/>
-          <w:b/>
-          <w:bCs/>
-          <w:sz w:val="24"/>
-          <w:szCs w:val="24"/>
-          <w:lang w:val="en-IN" w:eastAsia="en-IN" w:bidi="hi-IN"/>
-        </w:rPr>
-        <w:t xml:space="preserve"> Software </w:t>
-      </w:r>
-      <w:proofErr w:type="spellStart"/>
-      <w:r>
-        <w:rPr>
-          <w:rFonts w:asciiTheme="minorHAnsi" w:eastAsia="Times New Roman" w:hAnsiTheme="minorHAnsi" w:cstheme="minorHAnsi"/>
-          <w:b/>
-          <w:bCs/>
-          <w:sz w:val="24"/>
-          <w:szCs w:val="24"/>
-          <w:lang w:val="en-IN" w:eastAsia="en-IN" w:bidi="hi-IN"/>
-        </w:rPr>
-        <w:t>Pvt.</w:t>
-      </w:r>
-      <w:proofErr w:type="spellEnd"/>
-      <w:r>
-        <w:rPr>
-          <w:rFonts w:asciiTheme="minorHAnsi" w:eastAsia="Times New Roman" w:hAnsiTheme="minorHAnsi" w:cstheme="minorHAnsi"/>
-          <w:b/>
-          <w:bCs/>
-          <w:sz w:val="24"/>
-          <w:szCs w:val="24"/>
-          <w:lang w:val="en-IN" w:eastAsia="en-IN" w:bidi="hi-IN"/>
-        </w:rPr>
-        <w:t xml:space="preserve"> Ltd.</w:t>
-      </w:r>
-      <w:r>
-        <w:rPr>
-          <w:rFonts w:asciiTheme="minorHAnsi" w:eastAsia="Times New Roman" w:hAnsiTheme="minorHAnsi" w:cstheme="minorHAnsi"/>
-          <w:sz w:val="24"/>
-          <w:szCs w:val="24"/>
-          <w:lang w:val="en-IN" w:eastAsia="en-IN" w:bidi="hi-IN"/>
-        </w:rPr>
-        <w:t xml:space="preserve">, a growing technology-driven company focused on delivering modern web and software solutions. </w:t>
-      </w:r>
-      <w:proofErr w:type="spellStart"/>
-      <w:r>
-        <w:rPr>
-          <w:rFonts w:asciiTheme="minorHAnsi" w:eastAsia="Times New Roman" w:hAnsiTheme="minorHAnsi" w:cstheme="minorHAnsi"/>
-          <w:sz w:val="24"/>
-          <w:szCs w:val="24"/>
-          <w:lang w:val="en-IN" w:eastAsia="en-IN" w:bidi="hi-IN"/>
-        </w:rPr>
-        <w:t>ApexPlanet</w:t>
-      </w:r>
-      <w:proofErr w:type="spellEnd"/>
-      <w:r>
-        <w:rPr>
-          <w:rFonts w:asciiTheme="minorHAnsi" w:eastAsia="Times New Roman" w:hAnsiTheme="minorHAnsi" w:cstheme="minorHAnsi"/>
-          <w:sz w:val="24"/>
-          <w:szCs w:val="24"/>
-          <w:lang w:val="en-IN" w:eastAsia="en-IN" w:bidi="hi-IN"/>
-        </w:rPr>
-        <w:t xml:space="preserve"> is known for providing industry-oriented training, internships, and real-time project exposure to students and fresh graduates, helping them bridge the gap between academic learning and practical development.</w:t>
-      </w:r>
-    </w:p>
-    <w:p>
-      <w:pPr>
-        <w:contextualSpacing/>
-        <w:rPr>
-          <w:rFonts w:asciiTheme="minorHAnsi" w:eastAsia="Times New Roman" w:hAnsiTheme="minorHAnsi" w:cstheme="minorHAnsi"/>
-          <w:sz w:val="24"/>
-          <w:szCs w:val="24"/>
-          <w:lang w:val="en-IN" w:eastAsia="en-IN" w:bidi="hi-IN"/>
-        </w:rPr>
-      </w:pPr>
-      <w:r>
-        <w:rPr>
-          <w:rFonts w:asciiTheme="minorHAnsi" w:eastAsia="Times New Roman" w:hAnsiTheme="minorHAnsi" w:cstheme="minorHAnsi"/>
-          <w:sz w:val="24"/>
-          <w:szCs w:val="24"/>
-          <w:lang w:val="en-IN" w:eastAsia="en-IN" w:bidi="hi-IN"/>
-        </w:rPr>
-        <w:t xml:space="preserve">The company works in areas such as </w:t>
-      </w:r>
-      <w:r>
-        <w:rPr>
-          <w:rFonts w:asciiTheme="minorHAnsi" w:eastAsia="Times New Roman" w:hAnsiTheme="minorHAnsi" w:cstheme="minorHAnsi"/>
-          <w:b/>
-          <w:bCs/>
-          <w:sz w:val="24"/>
-          <w:szCs w:val="24"/>
-          <w:lang w:val="en-IN" w:eastAsia="en-IN" w:bidi="hi-IN"/>
-        </w:rPr>
-        <w:t>web development, software solutions, cloud-based applications, digital services, and IT consultancy</w:t>
-      </w:r>
-      <w:r>
-        <w:rPr>
-          <w:rFonts w:asciiTheme="minorHAnsi" w:eastAsia="Times New Roman" w:hAnsiTheme="minorHAnsi" w:cstheme="minorHAnsi"/>
-          <w:sz w:val="24"/>
-          <w:szCs w:val="24"/>
-          <w:lang w:val="en-IN" w:eastAsia="en-IN" w:bidi="hi-IN"/>
-        </w:rPr>
-        <w:t xml:space="preserve">. </w:t>
-      </w:r>
-      <w:proofErr w:type="spellStart"/>
-      <w:r>
-        <w:rPr>
-          <w:rFonts w:asciiTheme="minorHAnsi" w:eastAsia="Times New Roman" w:hAnsiTheme="minorHAnsi" w:cstheme="minorHAnsi"/>
-          <w:sz w:val="24"/>
-          <w:szCs w:val="24"/>
-          <w:lang w:val="en-IN" w:eastAsia="en-IN" w:bidi="hi-IN"/>
-        </w:rPr>
-        <w:t>ApexPlanet</w:t>
-      </w:r>
-      <w:proofErr w:type="spellEnd"/>
-      <w:r>
-        <w:rPr>
-          <w:rFonts w:asciiTheme="minorHAnsi" w:eastAsia="Times New Roman" w:hAnsiTheme="minorHAnsi" w:cstheme="minorHAnsi"/>
-          <w:sz w:val="24"/>
-          <w:szCs w:val="24"/>
-          <w:lang w:val="en-IN" w:eastAsia="en-IN" w:bidi="hi-IN"/>
-        </w:rPr>
-        <w:t xml:space="preserve"> emphasizes hands-on learning, project-based training, and best coding practices, enabling interns to gain confidence in real-world development environments.</w:t>
-      </w:r>
-    </w:p>
-    <w:p>
-      <w:pPr>
-        <w:contextualSpacing/>
-        <w:rPr>
-          <w:rFonts w:asciiTheme="minorHAnsi" w:eastAsia="Times New Roman" w:hAnsiTheme="minorHAnsi" w:cstheme="minorHAnsi"/>
-          <w:sz w:val="24"/>
-          <w:szCs w:val="24"/>
-          <w:lang w:val="en-IN" w:eastAsia="en-IN" w:bidi="hi-IN"/>
-        </w:rPr>
-      </w:pPr>
-      <w:r>
-        <w:rPr>
-          <w:rFonts w:asciiTheme="minorHAnsi" w:eastAsia="Times New Roman" w:hAnsiTheme="minorHAnsi" w:cstheme="minorHAnsi"/>
-          <w:sz w:val="24"/>
-          <w:szCs w:val="24"/>
-          <w:lang w:val="en-IN" w:eastAsia="en-IN" w:bidi="hi-IN"/>
-        </w:rPr>
-        <w:t xml:space="preserve">During the internship period, </w:t>
-      </w:r>
-      <w:proofErr w:type="spellStart"/>
-      <w:r>
-        <w:rPr>
-          <w:rFonts w:asciiTheme="minorHAnsi" w:eastAsia="Times New Roman" w:hAnsiTheme="minorHAnsi" w:cstheme="minorHAnsi"/>
-          <w:sz w:val="24"/>
-          <w:szCs w:val="24"/>
-          <w:lang w:val="en-IN" w:eastAsia="en-IN" w:bidi="hi-IN"/>
-        </w:rPr>
-        <w:t>ApexPlanet</w:t>
-      </w:r>
-      <w:proofErr w:type="spellEnd"/>
-      <w:r>
-        <w:rPr>
-          <w:rFonts w:asciiTheme="minorHAnsi" w:eastAsia="Times New Roman" w:hAnsiTheme="minorHAnsi" w:cstheme="minorHAnsi"/>
-          <w:sz w:val="24"/>
-          <w:szCs w:val="24"/>
-          <w:lang w:val="en-IN" w:eastAsia="en-IN" w:bidi="hi-IN"/>
-        </w:rPr>
-        <w:t xml:space="preserve"> provided structured guidance, technical mentoring, and continuous support that helped in understanding full-stack development concepts, database management, application security, and deployment processes. The professional environment encouraged innovation, problem-solving, and teamwork.</w:t>
-      </w:r>
-    </w:p>
-    <w:p>
-      <w:pPr>
-        <w:ind w:right="288"/>
-        <w:outlineLvl w:val="1"/>
-        <w:rPr>
-          <w:rFonts w:asciiTheme="minorHAnsi" w:eastAsia="Times New Roman" w:hAnsiTheme="minorHAnsi" w:cstheme="minorHAnsi"/>
-          <w:b/>
-          <w:bCs/>
-          <w:sz w:val="36"/>
-          <w:szCs w:val="36"/>
-          <w:lang w:val="en-IN" w:eastAsia="en-IN" w:bidi="hi-IN"/>
-        </w:rPr>
-      </w:pPr>
-      <w:r>
-        <w:rPr>
-          <w:rFonts w:asciiTheme="minorHAnsi" w:eastAsia="Times New Roman" w:hAnsiTheme="minorHAnsi" w:cstheme="minorHAnsi"/>
-          <w:b/>
-          <w:bCs/>
-          <w:sz w:val="36"/>
-          <w:szCs w:val="36"/>
-          <w:lang w:val="en-IN" w:eastAsia="en-IN" w:bidi="hi-IN"/>
-        </w:rPr>
-        <w:t>Company mission</w:t>
-      </w:r>
-    </w:p>
-    <w:p>
-      <w:pPr>
-        <w:rPr>
-          <w:rFonts w:asciiTheme="minorHAnsi" w:eastAsia="Times New Roman" w:hAnsiTheme="minorHAnsi" w:cstheme="minorHAnsi"/>
-          <w:sz w:val="24"/>
-          <w:szCs w:val="24"/>
-          <w:lang w:val="en-IN" w:eastAsia="en-IN" w:bidi="hi-IN"/>
-        </w:rPr>
-      </w:pPr>
-      <w:r>
-        <w:rPr>
-          <w:rFonts w:asciiTheme="minorHAnsi" w:eastAsia="Times New Roman" w:hAnsiTheme="minorHAnsi" w:cstheme="minorHAnsi"/>
-          <w:sz w:val="24"/>
-          <w:szCs w:val="24"/>
-          <w:lang w:val="en-IN" w:eastAsia="en-IN" w:bidi="hi-IN"/>
-        </w:rPr>
-        <w:t>Deliver high-quality, scalable, and secure software solutions</w:t>
-      </w:r>
-    </w:p>
-    <w:p>
-      <w:pPr>
-        <w:rPr>
-          <w:rFonts w:asciiTheme="minorHAnsi" w:eastAsia="Times New Roman" w:hAnsiTheme="minorHAnsi" w:cstheme="minorHAnsi"/>
-          <w:sz w:val="24"/>
-          <w:szCs w:val="24"/>
-          <w:lang w:val="en-IN" w:eastAsia="en-IN" w:bidi="hi-IN"/>
-        </w:rPr>
-      </w:pPr>
-      <w:r>
-        <w:rPr>
-          <w:rFonts w:asciiTheme="minorHAnsi" w:eastAsia="Times New Roman" w:hAnsiTheme="minorHAnsi" w:cstheme="minorHAnsi"/>
-          <w:sz w:val="24"/>
-          <w:szCs w:val="24"/>
-          <w:lang w:val="en-IN" w:eastAsia="en-IN" w:bidi="hi-IN"/>
-        </w:rPr>
-        <w:t>Empower students and professionals through practical, skill-based training</w:t>
-      </w:r>
-    </w:p>
-    <w:p>
-      <w:pPr>
-        <w:rPr>
-          <w:rFonts w:asciiTheme="minorHAnsi" w:eastAsia="Times New Roman" w:hAnsiTheme="minorHAnsi" w:cstheme="minorHAnsi"/>
-          <w:sz w:val="24"/>
-          <w:szCs w:val="24"/>
-          <w:lang w:val="en-IN" w:eastAsia="en-IN" w:bidi="hi-IN"/>
-        </w:rPr>
-      </w:pPr>
-      <w:r>
-        <w:rPr>
-          <w:rFonts w:asciiTheme="minorHAnsi" w:eastAsia="Times New Roman" w:hAnsiTheme="minorHAnsi" w:cstheme="minorHAnsi"/>
-          <w:sz w:val="24"/>
-          <w:szCs w:val="24"/>
-          <w:lang w:val="en-IN" w:eastAsia="en-IN" w:bidi="hi-IN"/>
-        </w:rPr>
-        <w:t>Promote innovation and continuous learning in emerging technologies</w:t>
-      </w:r>
-    </w:p>
-    <w:p>
-      <w:pPr>
-        <w:rPr>
-          <w:rFonts w:asciiTheme="minorHAnsi" w:eastAsia="Times New Roman" w:hAnsiTheme="minorHAnsi" w:cstheme="minorHAnsi"/>
-          <w:sz w:val="24"/>
-          <w:szCs w:val="24"/>
-          <w:lang w:val="en-IN" w:eastAsia="en-IN" w:bidi="hi-IN"/>
-        </w:rPr>
-      </w:pPr>
-      <w:r>
-        <w:rPr>
-          <w:rFonts w:asciiTheme="minorHAnsi" w:eastAsia="Times New Roman" w:hAnsiTheme="minorHAnsi" w:cstheme="minorHAnsi"/>
-          <w:sz w:val="24"/>
-          <w:szCs w:val="24"/>
-          <w:lang w:val="en-IN" w:eastAsia="en-IN" w:bidi="hi-IN"/>
-        </w:rPr>
-        <w:t>Bridge the gap between theoretical knowledge and industry requirements</w:t>
-      </w:r>
-    </w:p>
-    <w:p>
-      <w:pPr>
-        <w:rPr>
-          <w:rFonts w:asciiTheme="minorHAnsi" w:eastAsia="Times New Roman" w:hAnsiTheme="minorHAnsi" w:cstheme="minorHAnsi"/>
-          <w:sz w:val="24"/>
-          <w:szCs w:val="24"/>
-          <w:lang w:val="en-IN" w:eastAsia="en-IN" w:bidi="hi-IN"/>
-        </w:rPr>
-      </w:pPr>
-      <w:r>
-        <w:rPr>
-          <w:rFonts w:asciiTheme="minorHAnsi" w:eastAsia="Times New Roman" w:hAnsiTheme="minorHAnsi" w:cstheme="minorHAnsi"/>
-          <w:sz w:val="24"/>
-          <w:szCs w:val="24"/>
-          <w:lang w:val="en-IN" w:eastAsia="en-IN" w:bidi="hi-IN"/>
-        </w:rPr>
-        <w:t>Build a strong community of skilled developers and IT professionals</w:t>
-      </w:r>
-    </w:p>
-    <w:p>
-      <w:pPr>
-        <w:ind w:right="288"/>
-        <w:outlineLvl w:val="1"/>
-        <w:rPr>
-          <w:rFonts w:asciiTheme="minorHAnsi" w:eastAsia="Times New Roman" w:hAnsiTheme="minorHAnsi" w:cstheme="minorHAnsi"/>
-          <w:b/>
-          <w:bCs/>
-          <w:sz w:val="36"/>
-          <w:szCs w:val="36"/>
-          <w:lang w:val="en-IN" w:eastAsia="en-IN" w:bidi="hi-IN"/>
-        </w:rPr>
-      </w:pPr>
-      <w:r>
-        <w:rPr>
-          <w:rFonts w:asciiTheme="minorHAnsi" w:eastAsia="Times New Roman" w:hAnsiTheme="minorHAnsi" w:cstheme="minorHAnsi"/>
-          <w:b/>
-          <w:bCs/>
-          <w:sz w:val="36"/>
-          <w:szCs w:val="36"/>
-          <w:lang w:val="en-IN" w:eastAsia="en-IN" w:bidi="hi-IN"/>
-        </w:rPr>
-        <w:t>Company contact details</w:t>
-      </w:r>
-    </w:p>
-    <w:p>
-      <w:pPr>
-        <w:ind w:right="288"/>
-        <w:rPr>
-          <w:rFonts w:asciiTheme="minorHAnsi" w:eastAsia="Times New Roman" w:hAnsiTheme="minorHAnsi" w:cstheme="minorHAnsi"/>
-          <w:sz w:val="24"/>
-          <w:szCs w:val="24"/>
-          <w:lang w:val="en-IN" w:eastAsia="en-IN" w:bidi="hi-IN"/>
-        </w:rPr>
-      </w:pPr>
-      <w:r>
-        <w:rPr>
-          <w:rFonts w:asciiTheme="minorHAnsi" w:eastAsia="Times New Roman" w:hAnsiTheme="minorHAnsi" w:cstheme="minorHAnsi"/>
-          <w:b/>
-          <w:bCs/>
-          <w:sz w:val="24"/>
-          <w:szCs w:val="24"/>
-          <w:lang w:val="en-IN" w:eastAsia="en-IN" w:bidi="hi-IN"/>
-        </w:rPr>
-        <w:t>Company Name:</w:t>
-      </w:r>
-      <w:r>
-        <w:rPr>
-          <w:rFonts w:asciiTheme="minorHAnsi" w:eastAsia="Times New Roman" w:hAnsiTheme="minorHAnsi" w:cstheme="minorHAnsi"/>
-          <w:sz w:val="24"/>
-          <w:szCs w:val="24"/>
-          <w:lang w:val="en-IN" w:eastAsia="en-IN" w:bidi="hi-IN"/>
-        </w:rPr>
-        <w:t xml:space="preserve"> </w:t>
-      </w:r>
-      <w:proofErr w:type="spellStart"/>
-      <w:r>
-        <w:rPr>
-          <w:rFonts w:asciiTheme="minorHAnsi" w:eastAsia="Times New Roman" w:hAnsiTheme="minorHAnsi" w:cstheme="minorHAnsi"/>
-          <w:sz w:val="24"/>
-          <w:szCs w:val="24"/>
-          <w:lang w:val="en-IN" w:eastAsia="en-IN" w:bidi="hi-IN"/>
-        </w:rPr>
-        <w:t>ApexPlanet</w:t>
-      </w:r>
-      <w:proofErr w:type="spellEnd"/>
-      <w:r>
-        <w:rPr>
-          <w:rFonts w:asciiTheme="minorHAnsi" w:eastAsia="Times New Roman" w:hAnsiTheme="minorHAnsi" w:cstheme="minorHAnsi"/>
-          <w:sz w:val="24"/>
-          <w:szCs w:val="24"/>
-          <w:lang w:val="en-IN" w:eastAsia="en-IN" w:bidi="hi-IN"/>
-        </w:rPr>
-        <w:t xml:space="preserve"> Software </w:t>
-      </w:r>
-      <w:proofErr w:type="spellStart"/>
-      <w:r>
-        <w:rPr>
-          <w:rFonts w:asciiTheme="minorHAnsi" w:eastAsia="Times New Roman" w:hAnsiTheme="minorHAnsi" w:cstheme="minorHAnsi"/>
-          <w:sz w:val="24"/>
-          <w:szCs w:val="24"/>
-          <w:lang w:val="en-IN" w:eastAsia="en-IN" w:bidi="hi-IN"/>
-        </w:rPr>
-        <w:t>Pvt.</w:t>
-      </w:r>
-      <w:proofErr w:type="spellEnd"/>
-      <w:r>
-        <w:rPr>
-          <w:rFonts w:asciiTheme="minorHAnsi" w:eastAsia="Times New Roman" w:hAnsiTheme="minorHAnsi" w:cstheme="minorHAnsi"/>
-          <w:sz w:val="24"/>
-          <w:szCs w:val="24"/>
-          <w:lang w:val="en-IN" w:eastAsia="en-IN" w:bidi="hi-IN"/>
-        </w:rPr>
-        <w:t xml:space="preserve"> Ltd.</w:t>
-      </w:r>
-    </w:p>
-    <w:p>
-      <w:pPr>
-        <w:ind w:right="288"/>
-        <w:rPr>
-          <w:rFonts w:asciiTheme="minorHAnsi" w:eastAsia="Times New Roman" w:hAnsiTheme="minorHAnsi" w:cstheme="minorHAnsi"/>
-          <w:sz w:val="24"/>
-          <w:szCs w:val="24"/>
-          <w:lang w:val="en-IN" w:eastAsia="en-IN" w:bidi="hi-IN"/>
-        </w:rPr>
-      </w:pPr>
-      <w:r>
-        <w:rPr>
-          <w:rFonts w:asciiTheme="minorHAnsi" w:eastAsia="Times New Roman" w:hAnsiTheme="minorHAnsi" w:cstheme="minorHAnsi"/>
-          <w:b/>
-          <w:bCs/>
-          <w:sz w:val="24"/>
-          <w:szCs w:val="24"/>
-          <w:lang w:val="en-IN" w:eastAsia="en-IN" w:bidi="hi-IN"/>
-        </w:rPr>
-        <w:t>Industry:</w:t>
-      </w:r>
-      <w:r>
-        <w:rPr>
-          <w:rFonts w:asciiTheme="minorHAnsi" w:eastAsia="Times New Roman" w:hAnsiTheme="minorHAnsi" w:cstheme="minorHAnsi"/>
-          <w:sz w:val="24"/>
-          <w:szCs w:val="24"/>
-          <w:lang w:val="en-IN" w:eastAsia="en-IN" w:bidi="hi-IN"/>
-        </w:rPr>
-        <w:t xml:space="preserve"> Software Development &amp; IT Training</w:t>
-      </w:r>
-    </w:p>
-    <w:p>
-      <w:pPr>
-        <w:ind w:right="288"/>
-        <w:rPr>
-          <w:rFonts w:asciiTheme="minorHAnsi" w:eastAsia="Times New Roman" w:hAnsiTheme="minorHAnsi" w:cstheme="minorHAnsi"/>
-          <w:sz w:val="24"/>
-          <w:szCs w:val="24"/>
-          <w:lang w:val="en-IN" w:eastAsia="en-IN" w:bidi="hi-IN"/>
-        </w:rPr>
-      </w:pPr>
-      <w:r>
-        <w:rPr>
-          <w:rFonts w:asciiTheme="minorHAnsi" w:eastAsia="Times New Roman" w:hAnsiTheme="minorHAnsi" w:cstheme="minorHAnsi"/>
-          <w:b/>
-          <w:bCs/>
-          <w:sz w:val="24"/>
-          <w:szCs w:val="24"/>
-          <w:lang w:val="en-IN" w:eastAsia="en-IN" w:bidi="hi-IN"/>
-        </w:rPr>
-        <w:t>Website</w:t>
-      </w:r>
-      <w:r>
-        <w:rPr>
-          <w:rFonts w:asciiTheme="minorHAnsi" w:eastAsia="Times New Roman" w:hAnsiTheme="minorHAnsi" w:cstheme="minorHAnsi"/>
-          <w:sz w:val="24"/>
-          <w:szCs w:val="24"/>
-          <w:lang w:val="en-IN" w:eastAsia="en-IN" w:bidi="hi-IN"/>
-        </w:rPr>
-        <w:t xml:space="preserve"> : www.apexplanet.in</w:t>
-      </w:r>
-    </w:p>
-    <w:p>
-      <w:pPr>
-        <w:ind w:right="288"/>
         <w:rPr>
           <w:rFonts w:asciiTheme="minorHAnsi" w:eastAsia="Times New Roman" w:hAnsiTheme="minorHAnsi" w:cstheme="minorHAnsi"/>
           <w:sz w:val="24"/>
@@ -2253,7 +1637,12 @@
           <w:lang w:val="en-IN" w:eastAsia="en-IN" w:bidi="hi-IN"/>
         </w:rPr>
         <w:sectPr>
-          <w:footerReference w:type="default" r:id="rId9"/>
+          <w:headerReference w:type="even" r:id="rId9"/>
+          <w:headerReference w:type="default" r:id="rId10"/>
+          <w:footerReference w:type="even" r:id="rId11"/>
+          <w:footerReference w:type="default" r:id="rId12"/>
+          <w:headerReference w:type="first" r:id="rId13"/>
+          <w:footerReference w:type="first" r:id="rId14"/>
           <w:pgSz w:w="12240" w:h="15840"/>
           <w:pgMar w:top="1440" w:right="1080" w:bottom="1440" w:left="1080" w:header="720" w:footer="963" w:gutter="0"/>
           <w:cols w:space="720"/>
@@ -2261,37 +1650,6 @@
           <w:docGrid w:linePitch="360" w:charSpace="-2049"/>
         </w:sectPr>
       </w:pPr>
-      <w:r>
-        <w:rPr>
-          <w:rFonts w:asciiTheme="minorHAnsi" w:eastAsia="Times New Roman" w:hAnsiTheme="minorHAnsi" w:cstheme="minorHAnsi"/>
-          <w:b/>
-          <w:bCs/>
-          <w:sz w:val="24"/>
-          <w:szCs w:val="24"/>
-          <w:lang w:val="en-IN" w:eastAsia="en-IN" w:bidi="hi-IN"/>
-        </w:rPr>
-        <w:t>Email</w:t>
-      </w:r>
-      <w:r>
-        <w:rPr>
-          <w:rFonts w:asciiTheme="minorHAnsi" w:eastAsia="Times New Roman" w:hAnsiTheme="minorHAnsi" w:cstheme="minorHAnsi"/>
-          <w:sz w:val="24"/>
-          <w:szCs w:val="24"/>
-          <w:lang w:val="en-IN" w:eastAsia="en-IN" w:bidi="hi-IN"/>
-        </w:rPr>
-        <w:t xml:space="preserve"> : </w:t>
-      </w:r>
-      <w:proofErr w:type="spellStart"/>
-      <w:r>
-        <w:rPr>
-          <w:rFonts w:asciiTheme="minorHAnsi" w:eastAsia="Times New Roman" w:hAnsiTheme="minorHAnsi" w:cstheme="minorHAnsi"/>
-          <w:sz w:val="24"/>
-          <w:szCs w:val="24"/>
-          <w:lang w:val="en-IN" w:eastAsia="en-IN" w:bidi="hi-IN"/>
-        </w:rPr>
-        <w:t>info@apexplanet</w:t>
-      </w:r>
-      <w:proofErr w:type="spellEnd"/>
     </w:p>
     <w:p>
       <w:pPr>
@@ -5104,7 +4462,7 @@
                     <pic:cNvPicPr/>
                   </pic:nvPicPr>
                   <pic:blipFill>
-                    <a:blip r:embed="rId10">
+                    <a:blip r:embed="rId15">
                       <a:extLst>
                         <a:ext uri="{28A0092B-C50C-407E-A947-70E740481C1C}">
                           <a14:useLocalDpi xmlns:a14="http://schemas.microsoft.com/office/drawing/2010/main" val="0"/>
@@ -5471,7 +4829,7 @@
                     </pic:cNvPicPr>
                   </pic:nvPicPr>
                   <pic:blipFill rotWithShape="1">
-                    <a:blip r:embed="rId11" cstate="print">
+                    <a:blip r:embed="rId16" cstate="print">
                       <a:extLst>
                         <a:ext uri="{28A0092B-C50C-407E-A947-70E740481C1C}">
                           <a14:useLocalDpi xmlns:a14="http://schemas.microsoft.com/office/drawing/2010/main" val="0"/>
@@ -6853,7 +6211,7 @@
                     </pic:cNvPicPr>
                   </pic:nvPicPr>
                   <pic:blipFill>
-                    <a:blip r:embed="rId12">
+                    <a:blip r:embed="rId17">
                       <a:extLst>
                         <a:ext uri="{28A0092B-C50C-407E-A947-70E740481C1C}">
                           <a14:useLocalDpi xmlns:a14="http://schemas.microsoft.com/office/drawing/2010/main" val="0"/>
@@ -6967,7 +6325,7 @@
                     </pic:cNvPicPr>
                   </pic:nvPicPr>
                   <pic:blipFill>
-                    <a:blip r:embed="rId13">
+                    <a:blip r:embed="rId18">
                       <a:extLst>
                         <a:ext uri="{28A0092B-C50C-407E-A947-70E740481C1C}">
                           <a14:useLocalDpi xmlns:a14="http://schemas.microsoft.com/office/drawing/2010/main" val="0"/>
@@ -9152,7 +8510,7 @@
         </w:rPr>
         <w:t xml:space="preserve"> </w:t>
       </w:r>
-      <w:hyperlink r:id="rId14" w:history="1">
+      <w:hyperlink r:id="rId19" w:history="1">
         <w:r>
           <w:rPr>
             <w:rStyle w:val="Hyperlink"/>
@@ -9174,7 +8532,7 @@
         </w:rPr>
         <w:t xml:space="preserve">Live :  </w:t>
       </w:r>
-      <w:hyperlink r:id="rId15" w:history="1">
+      <w:hyperlink r:id="rId20" w:history="1">
         <w:r>
           <w:rPr>
             <w:rStyle w:val="Hyperlink"/>
@@ -9426,7 +8784,7 @@
                 <w:szCs w:val="22"/>
               </w:rPr>
             </w:pPr>
-            <w:hyperlink r:id="rId16" w:history="1">
+            <w:hyperlink r:id="rId21" w:history="1">
               <w:r>
                 <w:rPr>
                   <w:rStyle w:val="Hyperlink"/>
@@ -9562,7 +8920,7 @@
                 <w:szCs w:val="22"/>
               </w:rPr>
             </w:pPr>
-            <w:hyperlink r:id="rId17" w:history="1">
+            <w:hyperlink r:id="rId22" w:history="1">
               <w:r>
                 <w:rPr>
                   <w:rStyle w:val="Hyperlink"/>
@@ -9698,7 +9056,7 @@
                 <w:szCs w:val="22"/>
               </w:rPr>
             </w:pPr>
-            <w:hyperlink r:id="rId18" w:history="1">
+            <w:hyperlink r:id="rId23" w:history="1">
               <w:r>
                 <w:rPr>
                   <w:rStyle w:val="Hyperlink"/>
@@ -9844,7 +9202,7 @@
                 <w:szCs w:val="22"/>
               </w:rPr>
             </w:pPr>
-            <w:hyperlink r:id="rId19" w:history="1">
+            <w:hyperlink r:id="rId24" w:history="1">
               <w:r>
                 <w:rPr>
                   <w:rStyle w:val="Hyperlink"/>
@@ -9992,7 +9350,7 @@
                 <w:sz w:val="24"/>
               </w:rPr>
             </w:pPr>
-            <w:hyperlink r:id="rId20" w:history="1">
+            <w:hyperlink r:id="rId25" w:history="1">
               <w:r>
                 <w:rPr>
                   <w:rStyle w:val="Hyperlink"/>
@@ -10125,7 +9483,7 @@
                 <w:sz w:val="24"/>
               </w:rPr>
             </w:pPr>
-            <w:hyperlink r:id="rId21" w:history="1">
+            <w:hyperlink r:id="rId26" w:history="1">
               <w:r>
                 <w:rPr>
                   <w:rStyle w:val="Hyperlink"/>
@@ -10602,7 +9960,7 @@
       <w:r>
         <w:br/>
       </w:r>
-      <w:hyperlink r:id="rId22" w:tgtFrame="_new" w:history="1">
+      <w:hyperlink r:id="rId27" w:tgtFrame="_new" w:history="1">
         <w:r>
           <w:rPr>
             <w:rStyle w:val="Hyperlink"/>
@@ -10650,7 +10008,7 @@
       <w:r>
         <w:br/>
       </w:r>
-      <w:hyperlink r:id="rId23" w:tgtFrame="_new" w:history="1">
+      <w:hyperlink r:id="rId28" w:tgtFrame="_new" w:history="1">
         <w:r>
           <w:rPr>
             <w:rStyle w:val="Hyperlink"/>
@@ -10694,7 +10052,7 @@
       <w:r>
         <w:br/>
       </w:r>
-      <w:hyperlink r:id="rId24" w:tgtFrame="_new" w:history="1">
+      <w:hyperlink r:id="rId29" w:tgtFrame="_new" w:history="1">
         <w:r>
           <w:rPr>
             <w:rStyle w:val="Hyperlink"/>
@@ -10732,7 +10090,7 @@
       <w:r>
         <w:br/>
       </w:r>
-      <w:hyperlink r:id="rId25" w:tgtFrame="_new" w:history="1">
+      <w:hyperlink r:id="rId30" w:tgtFrame="_new" w:history="1">
         <w:r>
           <w:rPr>
             <w:rStyle w:val="Hyperlink"/>
@@ -10770,7 +10128,7 @@
       <w:r>
         <w:br/>
       </w:r>
-      <w:hyperlink r:id="rId26" w:tgtFrame="_new" w:history="1">
+      <w:hyperlink r:id="rId31" w:tgtFrame="_new" w:history="1">
         <w:r>
           <w:rPr>
             <w:rStyle w:val="Hyperlink"/>
@@ -10808,7 +10166,7 @@
       <w:r>
         <w:br/>
       </w:r>
-      <w:hyperlink r:id="rId27" w:tgtFrame="_new" w:history="1">
+      <w:hyperlink r:id="rId32" w:tgtFrame="_new" w:history="1">
         <w:r>
           <w:rPr>
             <w:rStyle w:val="Hyperlink"/>
@@ -10902,7 +10260,7 @@
                     </pic:cNvPicPr>
                   </pic:nvPicPr>
                   <pic:blipFill rotWithShape="1">
-                    <a:blip r:embed="rId28">
+                    <a:blip r:embed="rId33">
                       <a:extLst>
                         <a:ext uri="{28A0092B-C50C-407E-A947-70E740481C1C}">
                           <a14:useLocalDpi xmlns:a14="http://schemas.microsoft.com/office/drawing/2010/main" val="0"/>
@@ -11102,7 +10460,7 @@
                     </pic:cNvPicPr>
                   </pic:nvPicPr>
                   <pic:blipFill rotWithShape="1">
-                    <a:blip r:embed="rId29" cstate="print">
+                    <a:blip r:embed="rId34" cstate="print">
                       <a:extLst>
                         <a:ext uri="{28A0092B-C50C-407E-A947-70E740481C1C}">
                           <a14:useLocalDpi xmlns:a14="http://schemas.microsoft.com/office/drawing/2010/main" val="0"/>
@@ -11227,7 +10585,7 @@
                     <pic:cNvPicPr/>
                   </pic:nvPicPr>
                   <pic:blipFill>
-                    <a:blip r:embed="rId30">
+                    <a:blip r:embed="rId35">
                       <a:extLst>
                         <a:ext uri="{28A0092B-C50C-407E-A947-70E740481C1C}">
                           <a14:useLocalDpi xmlns:a14="http://schemas.microsoft.com/office/drawing/2010/main" val="0"/>
@@ -11286,7 +10644,7 @@
           <w:lang w:val="en-IN"/>
         </w:rPr>
         <w:drawing>
-          <wp:anchor distT="0" distB="0" distL="114300" distR="114300" simplePos="0" relativeHeight="251652608" behindDoc="1" locked="0" layoutInCell="1" allowOverlap="1" wp14:anchorId="04CCE995" wp14:editId="1FF55A28">
+          <wp:anchor distT="0" distB="0" distL="114300" distR="114300" simplePos="0" relativeHeight="251652608" behindDoc="1" locked="0" layoutInCell="1" allowOverlap="1" wp14:anchorId="04CCE995" wp14:editId="395E1E8A">
             <wp:simplePos x="0" y="0"/>
             <wp:positionH relativeFrom="column">
               <wp:posOffset>4340225</wp:posOffset>
@@ -11309,7 +10667,7 @@
                     <pic:cNvPicPr/>
                   </pic:nvPicPr>
                   <pic:blipFill>
-                    <a:blip r:embed="rId31" cstate="print">
+                    <a:blip r:embed="rId36" cstate="print">
                       <a:extLst>
                         <a:ext uri="{28A0092B-C50C-407E-A947-70E740481C1C}">
                           <a14:useLocalDpi xmlns:a14="http://schemas.microsoft.com/office/drawing/2010/main" val="0"/>
@@ -11363,7 +10721,7 @@
                     <pic:cNvPicPr/>
                   </pic:nvPicPr>
                   <pic:blipFill>
-                    <a:blip r:embed="rId32"/>
+                    <a:blip r:embed="rId37"/>
                     <a:stretch>
                       <a:fillRect/>
                     </a:stretch>
@@ -11423,7 +10781,7 @@
                     </pic:cNvPicPr>
                   </pic:nvPicPr>
                   <pic:blipFill rotWithShape="1">
-                    <a:blip r:embed="rId33" cstate="print">
+                    <a:blip r:embed="rId38" cstate="print">
                       <a:extLst>
                         <a:ext uri="{28A0092B-C50C-407E-A947-70E740481C1C}">
                           <a14:useLocalDpi xmlns:a14="http://schemas.microsoft.com/office/drawing/2010/main" val="0"/>
@@ -11487,7 +10845,7 @@
                     <pic:cNvPicPr/>
                   </pic:nvPicPr>
                   <pic:blipFill>
-                    <a:blip r:embed="rId34"/>
+                    <a:blip r:embed="rId39"/>
                     <a:stretch>
                       <a:fillRect/>
                     </a:stretch>
@@ -11619,7 +10977,7 @@
                     <pic:cNvPicPr/>
                   </pic:nvPicPr>
                   <pic:blipFill>
-                    <a:blip r:embed="rId35"/>
+                    <a:blip r:embed="rId40"/>
                     <a:stretch>
                       <a:fillRect/>
                     </a:stretch>
@@ -11708,7 +11066,7 @@
                     </pic:cNvPicPr>
                   </pic:nvPicPr>
                   <pic:blipFill>
-                    <a:blip r:embed="rId12">
+                    <a:blip r:embed="rId17">
                       <a:extLst>
                         <a:ext uri="{28A0092B-C50C-407E-A947-70E740481C1C}">
                           <a14:useLocalDpi xmlns:a14="http://schemas.microsoft.com/office/drawing/2010/main" val="0"/>
@@ -11849,7 +11207,7 @@
                     </pic:cNvPicPr>
                   </pic:nvPicPr>
                   <pic:blipFill>
-                    <a:blip r:embed="rId13">
+                    <a:blip r:embed="rId18">
                       <a:extLst>
                         <a:ext uri="{28A0092B-C50C-407E-A947-70E740481C1C}">
                           <a14:useLocalDpi xmlns:a14="http://schemas.microsoft.com/office/drawing/2010/main" val="0"/>
@@ -13382,7 +12740,7 @@
                     <pic:cNvPicPr/>
                   </pic:nvPicPr>
                   <pic:blipFill>
-                    <a:blip r:embed="rId36">
+                    <a:blip r:embed="rId41">
                       <a:extLst>
                         <a:ext uri="{28A0092B-C50C-407E-A947-70E740481C1C}">
                           <a14:useLocalDpi xmlns:a14="http://schemas.microsoft.com/office/drawing/2010/main" val="0"/>
@@ -13629,7 +12987,7 @@
                     </pic:cNvPicPr>
                   </pic:nvPicPr>
                   <pic:blipFill>
-                    <a:blip r:embed="rId37">
+                    <a:blip r:embed="rId42">
                       <a:extLst>
                         <a:ext uri="{28A0092B-C50C-407E-A947-70E740481C1C}">
                           <a14:useLocalDpi xmlns:a14="http://schemas.microsoft.com/office/drawing/2010/main" val="0"/>
@@ -13887,7 +13245,7 @@
                     </pic:cNvPicPr>
                   </pic:nvPicPr>
                   <pic:blipFill>
-                    <a:blip r:embed="rId38">
+                    <a:blip r:embed="rId43">
                       <a:extLst>
                         <a:ext uri="{28A0092B-C50C-407E-A947-70E740481C1C}">
                           <a14:useLocalDpi xmlns:a14="http://schemas.microsoft.com/office/drawing/2010/main" val="0"/>
@@ -13942,8 +13300,8 @@
       </w:pPr>
     </w:p>
     <w:sectPr>
-      <w:headerReference w:type="default" r:id="rId39"/>
-      <w:footerReference w:type="default" r:id="rId40"/>
+      <w:headerReference w:type="default" r:id="rId44"/>
+      <w:footerReference w:type="default" r:id="rId45"/>
       <w:pgSz w:w="12240" w:h="15840"/>
       <w:pgMar w:top="1440" w:right="1440" w:bottom="1440" w:left="1440" w:header="720" w:footer="963" w:gutter="0"/>
       <w:cols w:space="720"/>
@@ -13985,9 +13343,6 @@
     <w:pPr>
       <w:pStyle w:val="Footer"/>
     </w:pPr>
-    <w:r>
-      <w:tab/>
-    </w:r>
   </w:p>
 </w:ftr>
 </file>
@@ -13997,12 +13352,35 @@
   <w:p>
     <w:pPr>
       <w:pStyle w:val="Footer"/>
+    </w:pPr>
+    <w:r>
+      <w:tab/>
+    </w:r>
+  </w:p>
+</w:ftr>
+</file>
+
+<file path=word/footer3.xml><?xml version="1.0" encoding="utf-8"?>
+<w:ftr xmlns:wpc="http://schemas.microsoft.com/office/word/2010/wordprocessingCanvas" xmlns:cx="http://schemas.microsoft.com/office/drawing/2014/chartex" xmlns:cx1="http://schemas.microsoft.com/office/drawing/2015/9/8/chartex" xmlns:cx2="http://schemas.microsoft.com/office/drawing/2015/10/21/chartex" xmlns:cx3="http://schemas.microsoft.com/office/drawing/2016/5/9/chartex" xmlns:cx4="http://schemas.microsoft.com/office/drawing/2016/5/10/chartex" xmlns:cx5="http://schemas.microsoft.com/office/drawing/2016/5/11/chartex" xmlns:cx6="http://schemas.microsoft.com/office/drawing/2016/5/12/chartex" xmlns:cx7="http://schemas.microsoft.com/office/drawing/2016/5/13/chartex" xmlns:cx8="http://schemas.microsoft.com/office/drawing/2016/5/14/chartex" xmlns:mc="http://schemas.openxmlformats.org/markup-compatibility/2006" xmlns:aink="http://schemas.microsoft.com/office/drawing/2016/ink" xmlns:am3d="http://schemas.microsoft.com/office/drawing/2017/model3d" xmlns:o="urn:schemas-microsoft-com:office:office" xmlns:oel="http://schemas.microsoft.com/office/2019/extlst" xmlns:r="http://schemas.openxmlformats.org/officeDocument/2006/relationships" xmlns:m="http://schemas.openxmlformats.org/officeDocument/2006/math" xmlns:v="urn:schemas-microsoft-com:vml" xmlns:wp14="http://schemas.microsoft.com/office/word/2010/wordprocessingDrawing" xmlns:wp="http://schemas.openxmlformats.org/drawingml/2006/wordprocessingDrawing" xmlns:w10="urn:schemas-microsoft-com:office:word" xmlns:w="http://schemas.openxmlformats.org/wordprocessingml/2006/main" xmlns:w14="http://schemas.microsoft.com/office/word/2010/wordml" xmlns:w15="http://schemas.microsoft.com/office/word/2012/wordml" xmlns:w16cex="http://schemas.microsoft.com/office/word/2018/wordml/cex" xmlns:w16cid="http://schemas.microsoft.com/office/word/2016/wordml/cid" xmlns:w16="http://schemas.microsoft.com/office/word/2018/wordml" xmlns:w16du="http://schemas.microsoft.com/office/word/2023/wordml/word16du" xmlns:w16sdtdh="http://schemas.microsoft.com/office/word/2020/wordml/sdtdatahash" xmlns:w16sdtfl="http://schemas.microsoft.com/office/word/2024/wordml/sdtformatlock" xmlns:w16se="http://schemas.microsoft.com/office/word/2015/wordml/symex" xmlns:wpg="http://schemas.microsoft.com/office/word/2010/wordprocessingGroup" xmlns:wpi="http://schemas.microsoft.com/office/word/2010/wordprocessingInk" xmlns:wne="http://schemas.microsoft.com/office/word/2006/wordml" xmlns:wps="http://schemas.microsoft.com/office/word/2010/wordprocessingShape" mc:Ignorable="w14 w15 w16se w16cid w16 w16cex w16sdtdh w16sdtfl w16du wp14">
+  <w:p>
+    <w:pPr>
+      <w:pStyle w:val="Footer"/>
+    </w:pPr>
+  </w:p>
+</w:ftr>
+</file>
+
+<file path=word/footer4.xml><?xml version="1.0" encoding="utf-8"?>
+<w:ftr xmlns:wpc="http://schemas.microsoft.com/office/word/2010/wordprocessingCanvas" xmlns:cx="http://schemas.microsoft.com/office/drawing/2014/chartex" xmlns:cx1="http://schemas.microsoft.com/office/drawing/2015/9/8/chartex" xmlns:cx2="http://schemas.microsoft.com/office/drawing/2015/10/21/chartex" xmlns:cx3="http://schemas.microsoft.com/office/drawing/2016/5/9/chartex" xmlns:cx4="http://schemas.microsoft.com/office/drawing/2016/5/10/chartex" xmlns:cx5="http://schemas.microsoft.com/office/drawing/2016/5/11/chartex" xmlns:cx6="http://schemas.microsoft.com/office/drawing/2016/5/12/chartex" xmlns:cx7="http://schemas.microsoft.com/office/drawing/2016/5/13/chartex" xmlns:cx8="http://schemas.microsoft.com/office/drawing/2016/5/14/chartex" xmlns:mc="http://schemas.openxmlformats.org/markup-compatibility/2006" xmlns:aink="http://schemas.microsoft.com/office/drawing/2016/ink" xmlns:am3d="http://schemas.microsoft.com/office/drawing/2017/model3d" xmlns:o="urn:schemas-microsoft-com:office:office" xmlns:oel="http://schemas.microsoft.com/office/2019/extlst" xmlns:r="http://schemas.openxmlformats.org/officeDocument/2006/relationships" xmlns:m="http://schemas.openxmlformats.org/officeDocument/2006/math" xmlns:v="urn:schemas-microsoft-com:vml" xmlns:wp14="http://schemas.microsoft.com/office/word/2010/wordprocessingDrawing" xmlns:wp="http://schemas.openxmlformats.org/drawingml/2006/wordprocessingDrawing" xmlns:w10="urn:schemas-microsoft-com:office:word" xmlns:w="http://schemas.openxmlformats.org/wordprocessingml/2006/main" xmlns:w14="http://schemas.microsoft.com/office/word/2010/wordml" xmlns:w15="http://schemas.microsoft.com/office/word/2012/wordml" xmlns:w16cex="http://schemas.microsoft.com/office/word/2018/wordml/cex" xmlns:w16cid="http://schemas.microsoft.com/office/word/2016/wordml/cid" xmlns:w16="http://schemas.microsoft.com/office/word/2018/wordml" xmlns:w16du="http://schemas.microsoft.com/office/word/2023/wordml/word16du" xmlns:w16sdtdh="http://schemas.microsoft.com/office/word/2020/wordml/sdtdatahash" xmlns:w16sdtfl="http://schemas.microsoft.com/office/word/2024/wordml/sdtformatlock" xmlns:w16se="http://schemas.microsoft.com/office/word/2015/wordml/symex" xmlns:wpg="http://schemas.microsoft.com/office/word/2010/wordprocessingGroup" xmlns:wpi="http://schemas.microsoft.com/office/word/2010/wordprocessingInk" xmlns:wne="http://schemas.microsoft.com/office/word/2006/wordml" xmlns:wps="http://schemas.microsoft.com/office/word/2010/wordprocessingShape" mc:Ignorable="w14 w15 w16se w16cid w16 w16cex w16sdtdh w16sdtfl w16du wp14">
+  <w:p>
+    <w:pPr>
+      <w:pStyle w:val="Footer"/>
       <w:pBdr>
         <w:top w:val="single" w:sz="4" w:space="1" w:color="auto"/>
       </w:pBdr>
     </w:pPr>
     <w:r>
-      <w:t>CRUD based Blog web application (BlogScript)</w:t>
+      <w:t>BlogScript Blog Web Application</w:t>
     </w:r>
     <w:r>
       <w:tab/>
@@ -14109,6 +13487,36 @@
 </file>
 
 <file path=word/header1.xml><?xml version="1.0" encoding="utf-8"?>
+<w:hdr xmlns:wpc="http://schemas.microsoft.com/office/word/2010/wordprocessingCanvas" xmlns:cx="http://schemas.microsoft.com/office/drawing/2014/chartex" xmlns:cx1="http://schemas.microsoft.com/office/drawing/2015/9/8/chartex" xmlns:cx2="http://schemas.microsoft.com/office/drawing/2015/10/21/chartex" xmlns:cx3="http://schemas.microsoft.com/office/drawing/2016/5/9/chartex" xmlns:cx4="http://schemas.microsoft.com/office/drawing/2016/5/10/chartex" xmlns:cx5="http://schemas.microsoft.com/office/drawing/2016/5/11/chartex" xmlns:cx6="http://schemas.microsoft.com/office/drawing/2016/5/12/chartex" xmlns:cx7="http://schemas.microsoft.com/office/drawing/2016/5/13/chartex" xmlns:cx8="http://schemas.microsoft.com/office/drawing/2016/5/14/chartex" xmlns:mc="http://schemas.openxmlformats.org/markup-compatibility/2006" xmlns:aink="http://schemas.microsoft.com/office/drawing/2016/ink" xmlns:am3d="http://schemas.microsoft.com/office/drawing/2017/model3d" xmlns:o="urn:schemas-microsoft-com:office:office" xmlns:oel="http://schemas.microsoft.com/office/2019/extlst" xmlns:r="http://schemas.openxmlformats.org/officeDocument/2006/relationships" xmlns:m="http://schemas.openxmlformats.org/officeDocument/2006/math" xmlns:v="urn:schemas-microsoft-com:vml" xmlns:wp14="http://schemas.microsoft.com/office/word/2010/wordprocessingDrawing" xmlns:wp="http://schemas.openxmlformats.org/drawingml/2006/wordprocessingDrawing" xmlns:w10="urn:schemas-microsoft-com:office:word" xmlns:w="http://schemas.openxmlformats.org/wordprocessingml/2006/main" xmlns:w14="http://schemas.microsoft.com/office/word/2010/wordml" xmlns:w15="http://schemas.microsoft.com/office/word/2012/wordml" xmlns:w16cex="http://schemas.microsoft.com/office/word/2018/wordml/cex" xmlns:w16cid="http://schemas.microsoft.com/office/word/2016/wordml/cid" xmlns:w16="http://schemas.microsoft.com/office/word/2018/wordml" xmlns:w16du="http://schemas.microsoft.com/office/word/2023/wordml/word16du" xmlns:w16sdtdh="http://schemas.microsoft.com/office/word/2020/wordml/sdtdatahash" xmlns:w16sdtfl="http://schemas.microsoft.com/office/word/2024/wordml/sdtformatlock" xmlns:w16se="http://schemas.microsoft.com/office/word/2015/wordml/symex" xmlns:wpg="http://schemas.microsoft.com/office/word/2010/wordprocessingGroup" xmlns:wpi="http://schemas.microsoft.com/office/word/2010/wordprocessingInk" xmlns:wne="http://schemas.microsoft.com/office/word/2006/wordml" xmlns:wps="http://schemas.microsoft.com/office/word/2010/wordprocessingShape" mc:Ignorable="w14 w15 w16se w16cid w16 w16cex w16sdtdh w16sdtfl w16du wp14">
+  <w:p>
+    <w:pPr>
+      <w:pStyle w:val="Header"/>
+    </w:pPr>
+  </w:p>
+</w:hdr>
+</file>
+
+<file path=word/header2.xml><?xml version="1.0" encoding="utf-8"?>
+<w:hdr xmlns:wpc="http://schemas.microsoft.com/office/word/2010/wordprocessingCanvas" xmlns:cx="http://schemas.microsoft.com/office/drawing/2014/chartex" xmlns:cx1="http://schemas.microsoft.com/office/drawing/2015/9/8/chartex" xmlns:cx2="http://schemas.microsoft.com/office/drawing/2015/10/21/chartex" xmlns:cx3="http://schemas.microsoft.com/office/drawing/2016/5/9/chartex" xmlns:cx4="http://schemas.microsoft.com/office/drawing/2016/5/10/chartex" xmlns:cx5="http://schemas.microsoft.com/office/drawing/2016/5/11/chartex" xmlns:cx6="http://schemas.microsoft.com/office/drawing/2016/5/12/chartex" xmlns:cx7="http://schemas.microsoft.com/office/drawing/2016/5/13/chartex" xmlns:cx8="http://schemas.microsoft.com/office/drawing/2016/5/14/chartex" xmlns:mc="http://schemas.openxmlformats.org/markup-compatibility/2006" xmlns:aink="http://schemas.microsoft.com/office/drawing/2016/ink" xmlns:am3d="http://schemas.microsoft.com/office/drawing/2017/model3d" xmlns:o="urn:schemas-microsoft-com:office:office" xmlns:oel="http://schemas.microsoft.com/office/2019/extlst" xmlns:r="http://schemas.openxmlformats.org/officeDocument/2006/relationships" xmlns:m="http://schemas.openxmlformats.org/officeDocument/2006/math" xmlns:v="urn:schemas-microsoft-com:vml" xmlns:wp14="http://schemas.microsoft.com/office/word/2010/wordprocessingDrawing" xmlns:wp="http://schemas.openxmlformats.org/drawingml/2006/wordprocessingDrawing" xmlns:w10="urn:schemas-microsoft-com:office:word" xmlns:w="http://schemas.openxmlformats.org/wordprocessingml/2006/main" xmlns:w14="http://schemas.microsoft.com/office/word/2010/wordml" xmlns:w15="http://schemas.microsoft.com/office/word/2012/wordml" xmlns:w16cex="http://schemas.microsoft.com/office/word/2018/wordml/cex" xmlns:w16cid="http://schemas.microsoft.com/office/word/2016/wordml/cid" xmlns:w16="http://schemas.microsoft.com/office/word/2018/wordml" xmlns:w16du="http://schemas.microsoft.com/office/word/2023/wordml/word16du" xmlns:w16sdtdh="http://schemas.microsoft.com/office/word/2020/wordml/sdtdatahash" xmlns:w16sdtfl="http://schemas.microsoft.com/office/word/2024/wordml/sdtformatlock" xmlns:w16se="http://schemas.microsoft.com/office/word/2015/wordml/symex" xmlns:wpg="http://schemas.microsoft.com/office/word/2010/wordprocessingGroup" xmlns:wpi="http://schemas.microsoft.com/office/word/2010/wordprocessingInk" xmlns:wne="http://schemas.microsoft.com/office/word/2006/wordml" xmlns:wps="http://schemas.microsoft.com/office/word/2010/wordprocessingShape" mc:Ignorable="w14 w15 w16se w16cid w16 w16cex w16sdtdh w16sdtfl w16du wp14">
+  <w:p>
+    <w:pPr>
+      <w:pStyle w:val="Header"/>
+    </w:pPr>
+  </w:p>
+</w:hdr>
+</file>
+
+<file path=word/header3.xml><?xml version="1.0" encoding="utf-8"?>
+<w:hdr xmlns:wpc="http://schemas.microsoft.com/office/word/2010/wordprocessingCanvas" xmlns:cx="http://schemas.microsoft.com/office/drawing/2014/chartex" xmlns:cx1="http://schemas.microsoft.com/office/drawing/2015/9/8/chartex" xmlns:cx2="http://schemas.microsoft.com/office/drawing/2015/10/21/chartex" xmlns:cx3="http://schemas.microsoft.com/office/drawing/2016/5/9/chartex" xmlns:cx4="http://schemas.microsoft.com/office/drawing/2016/5/10/chartex" xmlns:cx5="http://schemas.microsoft.com/office/drawing/2016/5/11/chartex" xmlns:cx6="http://schemas.microsoft.com/office/drawing/2016/5/12/chartex" xmlns:cx7="http://schemas.microsoft.com/office/drawing/2016/5/13/chartex" xmlns:cx8="http://schemas.microsoft.com/office/drawing/2016/5/14/chartex" xmlns:mc="http://schemas.openxmlformats.org/markup-compatibility/2006" xmlns:aink="http://schemas.microsoft.com/office/drawing/2016/ink" xmlns:am3d="http://schemas.microsoft.com/office/drawing/2017/model3d" xmlns:o="urn:schemas-microsoft-com:office:office" xmlns:oel="http://schemas.microsoft.com/office/2019/extlst" xmlns:r="http://schemas.openxmlformats.org/officeDocument/2006/relationships" xmlns:m="http://schemas.openxmlformats.org/officeDocument/2006/math" xmlns:v="urn:schemas-microsoft-com:vml" xmlns:wp14="http://schemas.microsoft.com/office/word/2010/wordprocessingDrawing" xmlns:wp="http://schemas.openxmlformats.org/drawingml/2006/wordprocessingDrawing" xmlns:w10="urn:schemas-microsoft-com:office:word" xmlns:w="http://schemas.openxmlformats.org/wordprocessingml/2006/main" xmlns:w14="http://schemas.microsoft.com/office/word/2010/wordml" xmlns:w15="http://schemas.microsoft.com/office/word/2012/wordml" xmlns:w16cex="http://schemas.microsoft.com/office/word/2018/wordml/cex" xmlns:w16cid="http://schemas.microsoft.com/office/word/2016/wordml/cid" xmlns:w16="http://schemas.microsoft.com/office/word/2018/wordml" xmlns:w16du="http://schemas.microsoft.com/office/word/2023/wordml/word16du" xmlns:w16sdtdh="http://schemas.microsoft.com/office/word/2020/wordml/sdtdatahash" xmlns:w16sdtfl="http://schemas.microsoft.com/office/word/2024/wordml/sdtformatlock" xmlns:w16se="http://schemas.microsoft.com/office/word/2015/wordml/symex" xmlns:wpg="http://schemas.microsoft.com/office/word/2010/wordprocessingGroup" xmlns:wpi="http://schemas.microsoft.com/office/word/2010/wordprocessingInk" xmlns:wne="http://schemas.microsoft.com/office/word/2006/wordml" xmlns:wps="http://schemas.microsoft.com/office/word/2010/wordprocessingShape" mc:Ignorable="w14 w15 w16se w16cid w16 w16cex w16sdtdh w16sdtfl w16du wp14">
+  <w:p>
+    <w:pPr>
+      <w:pStyle w:val="Header"/>
+    </w:pPr>
+  </w:p>
+</w:hdr>
+</file>
+
+<file path=word/header4.xml><?xml version="1.0" encoding="utf-8"?>
 <w:hdr xmlns:wpc="http://schemas.microsoft.com/office/word/2010/wordprocessingCanvas" xmlns:cx="http://schemas.microsoft.com/office/drawing/2014/chartex" xmlns:cx1="http://schemas.microsoft.com/office/drawing/2015/9/8/chartex" xmlns:cx2="http://schemas.microsoft.com/office/drawing/2015/10/21/chartex" xmlns:cx3="http://schemas.microsoft.com/office/drawing/2016/5/9/chartex" xmlns:cx4="http://schemas.microsoft.com/office/drawing/2016/5/10/chartex" xmlns:cx5="http://schemas.microsoft.com/office/drawing/2016/5/11/chartex" xmlns:cx6="http://schemas.microsoft.com/office/drawing/2016/5/12/chartex" xmlns:cx7="http://schemas.microsoft.com/office/drawing/2016/5/13/chartex" xmlns:cx8="http://schemas.microsoft.com/office/drawing/2016/5/14/chartex" xmlns:mc="http://schemas.openxmlformats.org/markup-compatibility/2006" xmlns:aink="http://schemas.microsoft.com/office/drawing/2016/ink" xmlns:am3d="http://schemas.microsoft.com/office/drawing/2017/model3d" xmlns:o="urn:schemas-microsoft-com:office:office" xmlns:oel="http://schemas.microsoft.com/office/2019/extlst" xmlns:r="http://schemas.openxmlformats.org/officeDocument/2006/relationships" xmlns:m="http://schemas.openxmlformats.org/officeDocument/2006/math" xmlns:v="urn:schemas-microsoft-com:vml" xmlns:wp14="http://schemas.microsoft.com/office/word/2010/wordprocessingDrawing" xmlns:wp="http://schemas.openxmlformats.org/drawingml/2006/wordprocessingDrawing" xmlns:w10="urn:schemas-microsoft-com:office:word" xmlns:w="http://schemas.openxmlformats.org/wordprocessingml/2006/main" xmlns:w14="http://schemas.microsoft.com/office/word/2010/wordml" xmlns:w15="http://schemas.microsoft.com/office/word/2012/wordml" xmlns:w16cex="http://schemas.microsoft.com/office/word/2018/wordml/cex" xmlns:w16cid="http://schemas.microsoft.com/office/word/2016/wordml/cid" xmlns:w16="http://schemas.microsoft.com/office/word/2018/wordml" xmlns:w16du="http://schemas.microsoft.com/office/word/2023/wordml/word16du" xmlns:w16sdtdh="http://schemas.microsoft.com/office/word/2020/wordml/sdtdatahash" xmlns:w16sdtfl="http://schemas.microsoft.com/office/word/2024/wordml/sdtformatlock" xmlns:w16se="http://schemas.microsoft.com/office/word/2015/wordml/symex" xmlns:wpg="http://schemas.microsoft.com/office/word/2010/wordprocessingGroup" xmlns:wpi="http://schemas.microsoft.com/office/word/2010/wordprocessingInk" xmlns:wne="http://schemas.microsoft.com/office/word/2006/wordml" xmlns:wps="http://schemas.microsoft.com/office/word/2010/wordprocessingShape" mc:Ignorable="w14 w15 w16se w16cid w16 w16cex w16sdtdh w16sdtfl w16du wp14">
   <w:p>
     <w:pPr>
@@ -14130,7 +13538,7 @@
       <w:t xml:space="preserve">Version </w:t>
     </w:r>
     <w:r>
-      <w:t>3</w:t>
+      <w:t>1</w:t>
     </w:r>
     <w:r>
       <w:t>.0</w:t>
@@ -14139,13 +13547,10 @@
       <w:t xml:space="preserve">                                    </w:t>
     </w:r>
     <w:r>
-      <w:t>Internship</w:t>
+      <w:t>Major</w:t>
     </w:r>
     <w:r>
-      <w:t xml:space="preserve">-Project </w:t>
-    </w:r>
-    <w:r>
-      <w:t>Report</w:t>
+      <w:t xml:space="preserve"> Project Synopsis</w:t>
     </w:r>
   </w:p>
 </w:hdr>

</xml_diff>